<commit_message>
feat: Add SHA-256 Content-Hash Caching and Daily Log Session Append/Merge (60 tests pass)
</commit_message>
<xml_diff>
--- a/secure_local_data/E2E_가설흙막이_검토의견서.docx
+++ b/secure_local_data/E2E_가설흙막이_검토의견서.docx
@@ -83,7 +83,7 @@
               <w:rPr>
                 <w:sz w:val="19"/>
               </w:rPr>
-              <w:t>SWCM-REV-20260829-01</w:t>
+              <w:t>SWCM-REV-20260830-01</w:t>
             </w:r>
           </w:p>
         </w:tc>
@@ -127,7 +127,7 @@
               <w:rPr>
                 <w:sz w:val="19"/>
               </w:rPr>
-              <w:t>2026년 08월 29일</w:t>
+              <w:t>2026년 08월 30일</w:t>
             </w:r>
           </w:p>
         </w:tc>
@@ -663,7 +663,7 @@
           <w:color w:val="1A365D"/>
           <w:sz w:val="20"/>
         </w:rPr>
-        <w:t>작성일: 2026년 08월 29일</w:t>
+        <w:t>작성일: 2026년 08월 30일</w:t>
         <w:br/>
         <w:t>주식회사 삼우씨엠건축사사무소 건설사업관리단 (인)</w:t>
       </w:r>

</xml_diff>